<commit_message>
Update Lab 3 report
</commit_message>
<xml_diff>
--- a/lab_03/docs/lw-report-03.docx
+++ b/lab_03/docs/lw-report-03.docx
@@ -4172,7 +4172,67 @@
           <w:szCs w:val="28"/>
           <w:lang w:val="ru-RU"/>
         </w:rPr>
-        <w:t xml:space="preserve"> at each iteration, outputting the formatted </w:t>
+        <w:t xml:space="preserve"> at each iteration, </w:t>
+      </w:r>
+      <w:proofErr w:type="spellStart"/>
+      <w:r>
+        <w:rPr>
+          <w:bCs/>
+          <w:sz w:val="28"/>
+          <w:szCs w:val="28"/>
+          <w:lang w:val="ru-RU"/>
+        </w:rPr>
+        <w:t>outputting</w:t>
+      </w:r>
+      <w:proofErr w:type="spellEnd"/>
+      <w:r>
+        <w:rPr>
+          <w:bCs/>
+          <w:sz w:val="28"/>
+          <w:szCs w:val="28"/>
+          <w:lang w:val="ru-RU"/>
+        </w:rPr>
+        <w:t xml:space="preserve"> </w:t>
+      </w:r>
+      <w:proofErr w:type="spellStart"/>
+      <w:r>
+        <w:rPr>
+          <w:bCs/>
+          <w:sz w:val="28"/>
+          <w:szCs w:val="28"/>
+          <w:lang w:val="ru-RU"/>
+        </w:rPr>
+        <w:t>the</w:t>
+      </w:r>
+      <w:proofErr w:type="spellEnd"/>
+      <w:r>
+        <w:rPr>
+          <w:bCs/>
+          <w:sz w:val="28"/>
+          <w:szCs w:val="28"/>
+          <w:lang w:val="ru-RU"/>
+        </w:rPr>
+        <w:t xml:space="preserve"> </w:t>
+      </w:r>
+      <w:proofErr w:type="spellStart"/>
+      <w:r>
+        <w:rPr>
+          <w:bCs/>
+          <w:sz w:val="28"/>
+          <w:szCs w:val="28"/>
+          <w:lang w:val="ru-RU"/>
+        </w:rPr>
+        <w:t>formatted</w:t>
+      </w:r>
+      <w:proofErr w:type="spellEnd"/>
+      <w:r>
+        <w:rPr>
+          <w:bCs/>
+          <w:sz w:val="28"/>
+          <w:szCs w:val="28"/>
+          <w:lang w:val="ru-RU"/>
+        </w:rPr>
+        <w:t xml:space="preserve"> </w:t>
       </w:r>
       <w:proofErr w:type="spellStart"/>
       <w:r>
@@ -4314,57 +4374,31 @@
         </w:rPr>
       </w:pPr>
       <w:r>
-        <w:rPr>
-          <w:noProof/>
-        </w:rPr>
-        <w:drawing>
-          <wp:inline distT="0" distB="0" distL="0" distR="0" wp14:anchorId="7327C05E" wp14:editId="6AB3352D">
-            <wp:extent cx="4459063" cy="8431481"/>
-            <wp:effectExtent l="0" t="0" r="0" b="8255"/>
-            <wp:docPr id="1191693443" name="Рисунок 70"/>
-            <wp:cNvGraphicFramePr>
-              <a:graphicFrameLocks xmlns:a="http://schemas.openxmlformats.org/drawingml/2006/main" noChangeAspect="1"/>
-            </wp:cNvGraphicFramePr>
-            <a:graphic xmlns:a="http://schemas.openxmlformats.org/drawingml/2006/main">
-              <a:graphicData uri="http://schemas.openxmlformats.org/drawingml/2006/picture">
-                <pic:pic xmlns:pic="http://schemas.openxmlformats.org/drawingml/2006/picture">
-                  <pic:nvPicPr>
-                    <pic:cNvPr id="0" name="Picture 3"/>
-                    <pic:cNvPicPr>
-                      <a:picLocks noChangeAspect="1" noChangeArrowheads="1"/>
-                    </pic:cNvPicPr>
-                  </pic:nvPicPr>
-                  <pic:blipFill>
-                    <a:blip r:embed="rId11" cstate="print">
-                      <a:extLst>
-                        <a:ext uri="{28A0092B-C50C-407E-A947-70E740481C1C}">
-                          <a14:useLocalDpi xmlns:a14="http://schemas.microsoft.com/office/drawing/2010/main" val="0"/>
-                        </a:ext>
-                      </a:extLst>
-                    </a:blip>
-                    <a:srcRect/>
-                    <a:stretch>
-                      <a:fillRect/>
-                    </a:stretch>
-                  </pic:blipFill>
-                  <pic:spPr bwMode="auto">
-                    <a:xfrm>
-                      <a:off x="0" y="0"/>
-                      <a:ext cx="4461623" cy="8436321"/>
-                    </a:xfrm>
-                    <a:prstGeom prst="rect">
-                      <a:avLst/>
-                    </a:prstGeom>
-                    <a:noFill/>
-                    <a:ln>
-                      <a:noFill/>
-                    </a:ln>
-                  </pic:spPr>
-                </pic:pic>
-              </a:graphicData>
-            </a:graphic>
-          </wp:inline>
-        </w:drawing>
+        <w:object w:dxaOrig="12493" w:dyaOrig="23632" w14:anchorId="15B12440">
+          <v:shapetype id="_x0000_t75" coordsize="21600,21600" o:spt="75" o:preferrelative="t" path="m@4@5l@4@11@9@11@9@5xe" filled="f" stroked="f">
+            <v:stroke joinstyle="miter"/>
+            <v:formulas>
+              <v:f eqn="if lineDrawn pixelLineWidth 0"/>
+              <v:f eqn="sum @0 1 0"/>
+              <v:f eqn="sum 0 0 @1"/>
+              <v:f eqn="prod @2 1 2"/>
+              <v:f eqn="prod @3 21600 pixelWidth"/>
+              <v:f eqn="prod @3 21600 pixelHeight"/>
+              <v:f eqn="sum @0 0 1"/>
+              <v:f eqn="prod @6 1 2"/>
+              <v:f eqn="prod @7 21600 pixelWidth"/>
+              <v:f eqn="sum @8 21600 0"/>
+              <v:f eqn="prod @7 21600 pixelHeight"/>
+              <v:f eqn="sum @10 21600 0"/>
+            </v:formulas>
+            <v:path o:extrusionok="f" gradientshapeok="t" o:connecttype="rect"/>
+            <o:lock v:ext="edit" aspectratio="t"/>
+          </v:shapetype>
+          <v:shape id="_x0000_i1026" type="#_x0000_t75" style="width:356.25pt;height:672pt" o:ole="">
+            <v:imagedata r:id="rId11" o:title=""/>
+          </v:shape>
+          <o:OLEObject Type="Embed" ProgID="Unknown" ShapeID="_x0000_i1026" DrawAspect="Content" ObjectID="_1852722614" r:id="rId12"/>
+        </w:object>
       </w:r>
     </w:p>
     <w:p>
@@ -5861,7 +5895,7 @@
                     <pic:cNvPicPr/>
                   </pic:nvPicPr>
                   <pic:blipFill>
-                    <a:blip r:embed="rId12"/>
+                    <a:blip r:embed="rId13"/>
                     <a:stretch>
                       <a:fillRect/>
                     </a:stretch>
@@ -7277,29 +7311,7 @@
           <w:szCs w:val="28"/>
           <w:lang w:val="ru-RU"/>
         </w:rPr>
-        <w:t xml:space="preserve"> </w:t>
-      </w:r>
-      <w:proofErr w:type="spellStart"/>
-      <w:r>
-        <w:rPr>
-          <w:bCs/>
-          <w:iCs/>
-          <w:sz w:val="28"/>
-          <w:szCs w:val="28"/>
-          <w:lang w:val="ru-RU"/>
-        </w:rPr>
-        <w:t>and</w:t>
-      </w:r>
-      <w:proofErr w:type="spellEnd"/>
-      <w:r>
-        <w:rPr>
-          <w:bCs/>
-          <w:iCs/>
-          <w:sz w:val="28"/>
-          <w:szCs w:val="28"/>
-          <w:lang w:val="ru-RU"/>
-        </w:rPr>
-        <w:t xml:space="preserve"> </w:t>
+        <w:t xml:space="preserve"> and </w:t>
       </w:r>
       <m:oMath>
         <m:r>
@@ -7383,73 +7395,7 @@
           <w:szCs w:val="28"/>
           <w:lang w:val="ru-RU"/>
         </w:rPr>
-        <w:t xml:space="preserve">. Terms are sequentially applied using dedicated multiply() and divide() functions that dynamically re-normalize the mantissa to maintain high numerical precision. Input validation for real numbers and division-by-zero edge case handling are supported by the I/O utilities </w:t>
-      </w:r>
-      <w:proofErr w:type="spellStart"/>
-      <w:r>
-        <w:rPr>
-          <w:bCs/>
-          <w:iCs/>
-          <w:sz w:val="28"/>
-          <w:szCs w:val="28"/>
-          <w:lang w:val="ru-RU"/>
-        </w:rPr>
-        <w:t>detailed</w:t>
-      </w:r>
-      <w:proofErr w:type="spellEnd"/>
-      <w:r>
-        <w:rPr>
-          <w:bCs/>
-          <w:iCs/>
-          <w:sz w:val="28"/>
-          <w:szCs w:val="28"/>
-          <w:lang w:val="ru-RU"/>
-        </w:rPr>
-        <w:t xml:space="preserve"> </w:t>
-      </w:r>
-      <w:proofErr w:type="spellStart"/>
-      <w:r>
-        <w:rPr>
-          <w:bCs/>
-          <w:iCs/>
-          <w:sz w:val="28"/>
-          <w:szCs w:val="28"/>
-          <w:lang w:val="ru-RU"/>
-        </w:rPr>
-        <w:t>in</w:t>
-      </w:r>
-      <w:proofErr w:type="spellEnd"/>
-      <w:r>
-        <w:rPr>
-          <w:bCs/>
-          <w:iCs/>
-          <w:sz w:val="28"/>
-          <w:szCs w:val="28"/>
-          <w:lang w:val="ru-RU"/>
-        </w:rPr>
-        <w:t xml:space="preserve"> </w:t>
-      </w:r>
-      <w:proofErr w:type="spellStart"/>
-      <w:r>
-        <w:rPr>
-          <w:bCs/>
-          <w:iCs/>
-          <w:sz w:val="28"/>
-          <w:szCs w:val="28"/>
-          <w:lang w:val="ru-RU"/>
-        </w:rPr>
-        <w:t>Appendix</w:t>
-      </w:r>
-      <w:proofErr w:type="spellEnd"/>
-      <w:r>
-        <w:rPr>
-          <w:bCs/>
-          <w:iCs/>
-          <w:sz w:val="28"/>
-          <w:szCs w:val="28"/>
-          <w:lang w:val="ru-RU"/>
-        </w:rPr>
-        <w:t xml:space="preserve"> F</w:t>
+        <w:t>. Terms are sequentially applied using dedicated multiply() and divide() functions that dynamically re-normalize the mantissa to maintain high numerical precision. Input validation for real numbers and division-by-zero edge case handling are supported by the I/O utilities detailed in Appendix F</w:t>
       </w:r>
       <w:r>
         <w:rPr>
@@ -7508,57 +7454,12 @@
         </w:rPr>
       </w:pPr>
       <w:r>
-        <w:rPr>
-          <w:noProof/>
-        </w:rPr>
-        <w:drawing>
-          <wp:inline distT="0" distB="0" distL="0" distR="0" wp14:anchorId="4966D681" wp14:editId="20AFEBD7">
-            <wp:extent cx="6030595" cy="8420100"/>
-            <wp:effectExtent l="0" t="0" r="8255" b="0"/>
-            <wp:docPr id="1058610710" name="Рисунок 71"/>
-            <wp:cNvGraphicFramePr>
-              <a:graphicFrameLocks xmlns:a="http://schemas.openxmlformats.org/drawingml/2006/main" noChangeAspect="1"/>
-            </wp:cNvGraphicFramePr>
-            <a:graphic xmlns:a="http://schemas.openxmlformats.org/drawingml/2006/main">
-              <a:graphicData uri="http://schemas.openxmlformats.org/drawingml/2006/picture">
-                <pic:pic xmlns:pic="http://schemas.openxmlformats.org/drawingml/2006/picture">
-                  <pic:nvPicPr>
-                    <pic:cNvPr id="0" name="Picture 5"/>
-                    <pic:cNvPicPr>
-                      <a:picLocks noChangeAspect="1" noChangeArrowheads="1"/>
-                    </pic:cNvPicPr>
-                  </pic:nvPicPr>
-                  <pic:blipFill>
-                    <a:blip r:embed="rId13" cstate="print">
-                      <a:extLst>
-                        <a:ext uri="{28A0092B-C50C-407E-A947-70E740481C1C}">
-                          <a14:useLocalDpi xmlns:a14="http://schemas.microsoft.com/office/drawing/2010/main" val="0"/>
-                        </a:ext>
-                      </a:extLst>
-                    </a:blip>
-                    <a:srcRect/>
-                    <a:stretch>
-                      <a:fillRect/>
-                    </a:stretch>
-                  </pic:blipFill>
-                  <pic:spPr bwMode="auto">
-                    <a:xfrm>
-                      <a:off x="0" y="0"/>
-                      <a:ext cx="6030595" cy="8420100"/>
-                    </a:xfrm>
-                    <a:prstGeom prst="rect">
-                      <a:avLst/>
-                    </a:prstGeom>
-                    <a:noFill/>
-                    <a:ln>
-                      <a:noFill/>
-                    </a:ln>
-                  </pic:spPr>
-                </pic:pic>
-              </a:graphicData>
-            </a:graphic>
-          </wp:inline>
-        </w:drawing>
+        <w:object w:dxaOrig="13881" w:dyaOrig="19462" w14:anchorId="0E5D9B56">
+          <v:shape id="_x0000_i1030" type="#_x0000_t75" style="width:475pt;height:665.2pt" o:ole="">
+            <v:imagedata r:id="rId14" o:title=""/>
+          </v:shape>
+          <o:OLEObject Type="Embed" ProgID="Unknown" ShapeID="_x0000_i1030" DrawAspect="Content" ObjectID="_1852722615" r:id="rId15"/>
+        </w:object>
       </w:r>
     </w:p>
     <w:p>
@@ -12383,7 +12284,7 @@
                     <pic:cNvPicPr/>
                   </pic:nvPicPr>
                   <pic:blipFill>
-                    <a:blip r:embed="rId14"/>
+                    <a:blip r:embed="rId16"/>
                     <a:stretch>
                       <a:fillRect/>
                     </a:stretch>
@@ -13063,7 +12964,67 @@
           <w:szCs w:val="28"/>
           <w:lang w:val="ru-RU"/>
         </w:rPr>
-        <w:t xml:space="preserve"> by iteratively extracting its least significant digit using modulo arithmetic (% 10) and reducing the remaining value via integer division (/ 10). To seamlessly handle negative input values and avoid two's complement overflow edge cases (such as LONG_MIN), the input is converted to its absolute magnitude using an unsigned long container prior to processing. An iterative while </w:t>
+        <w:t xml:space="preserve"> by iteratively extracting its least significant digit using modulo arithmetic (% 10) and reducing the remaining value via integer division (/ 10). To seamlessly handle negative input values and avoid two's complement overflow edge cases (such as LONG_MIN), the input is converted to its absolute magnitude using an unsigned long container prior to processing. </w:t>
+      </w:r>
+      <w:proofErr w:type="spellStart"/>
+      <w:r>
+        <w:rPr>
+          <w:bCs/>
+          <w:sz w:val="28"/>
+          <w:szCs w:val="28"/>
+          <w:lang w:val="ru-RU"/>
+        </w:rPr>
+        <w:t>An</w:t>
+      </w:r>
+      <w:proofErr w:type="spellEnd"/>
+      <w:r>
+        <w:rPr>
+          <w:bCs/>
+          <w:sz w:val="28"/>
+          <w:szCs w:val="28"/>
+          <w:lang w:val="ru-RU"/>
+        </w:rPr>
+        <w:t xml:space="preserve"> </w:t>
+      </w:r>
+      <w:proofErr w:type="spellStart"/>
+      <w:r>
+        <w:rPr>
+          <w:bCs/>
+          <w:sz w:val="28"/>
+          <w:szCs w:val="28"/>
+          <w:lang w:val="ru-RU"/>
+        </w:rPr>
+        <w:t>iterative</w:t>
+      </w:r>
+      <w:proofErr w:type="spellEnd"/>
+      <w:r>
+        <w:rPr>
+          <w:bCs/>
+          <w:sz w:val="28"/>
+          <w:szCs w:val="28"/>
+          <w:lang w:val="ru-RU"/>
+        </w:rPr>
+        <w:t xml:space="preserve"> </w:t>
+      </w:r>
+      <w:proofErr w:type="spellStart"/>
+      <w:r>
+        <w:rPr>
+          <w:bCs/>
+          <w:sz w:val="28"/>
+          <w:szCs w:val="28"/>
+          <w:lang w:val="ru-RU"/>
+        </w:rPr>
+        <w:t>while</w:t>
+      </w:r>
+      <w:proofErr w:type="spellEnd"/>
+      <w:r>
+        <w:rPr>
+          <w:bCs/>
+          <w:sz w:val="28"/>
+          <w:szCs w:val="28"/>
+          <w:lang w:val="ru-RU"/>
+        </w:rPr>
+        <w:t xml:space="preserve"> </w:t>
       </w:r>
       <w:proofErr w:type="spellStart"/>
       <w:r>
@@ -13664,57 +13625,12 @@
         </w:rPr>
       </w:pPr>
       <w:r>
-        <w:rPr>
-          <w:noProof/>
-        </w:rPr>
-        <w:drawing>
-          <wp:inline distT="0" distB="0" distL="0" distR="0" wp14:anchorId="5A314F89" wp14:editId="445B17FE">
-            <wp:extent cx="3667593" cy="8633361"/>
-            <wp:effectExtent l="0" t="0" r="9525" b="0"/>
-            <wp:docPr id="114538835" name="Рисунок 72"/>
-            <wp:cNvGraphicFramePr>
-              <a:graphicFrameLocks xmlns:a="http://schemas.openxmlformats.org/drawingml/2006/main" noChangeAspect="1"/>
-            </wp:cNvGraphicFramePr>
-            <a:graphic xmlns:a="http://schemas.openxmlformats.org/drawingml/2006/main">
-              <a:graphicData uri="http://schemas.openxmlformats.org/drawingml/2006/picture">
-                <pic:pic xmlns:pic="http://schemas.openxmlformats.org/drawingml/2006/picture">
-                  <pic:nvPicPr>
-                    <pic:cNvPr id="0" name="Picture 7"/>
-                    <pic:cNvPicPr>
-                      <a:picLocks noChangeAspect="1" noChangeArrowheads="1"/>
-                    </pic:cNvPicPr>
-                  </pic:nvPicPr>
-                  <pic:blipFill>
-                    <a:blip r:embed="rId15">
-                      <a:extLst>
-                        <a:ext uri="{28A0092B-C50C-407E-A947-70E740481C1C}">
-                          <a14:useLocalDpi xmlns:a14="http://schemas.microsoft.com/office/drawing/2010/main" val="0"/>
-                        </a:ext>
-                      </a:extLst>
-                    </a:blip>
-                    <a:srcRect/>
-                    <a:stretch>
-                      <a:fillRect/>
-                    </a:stretch>
-                  </pic:blipFill>
-                  <pic:spPr bwMode="auto">
-                    <a:xfrm>
-                      <a:off x="0" y="0"/>
-                      <a:ext cx="3674506" cy="8649634"/>
-                    </a:xfrm>
-                    <a:prstGeom prst="rect">
-                      <a:avLst/>
-                    </a:prstGeom>
-                    <a:noFill/>
-                    <a:ln>
-                      <a:noFill/>
-                    </a:ln>
-                  </pic:spPr>
-                </pic:pic>
-              </a:graphicData>
-            </a:graphic>
-          </wp:inline>
-        </w:drawing>
+        <w:object w:dxaOrig="9716" w:dyaOrig="19462" w14:anchorId="0B3C88E4">
+          <v:shape id="_x0000_i1032" type="#_x0000_t75" style="width:336.35pt;height:672.7pt" o:ole="">
+            <v:imagedata r:id="rId17" o:title=""/>
+          </v:shape>
+          <o:OLEObject Type="Embed" ProgID="Unknown" ShapeID="_x0000_i1032" DrawAspect="Content" ObjectID="_1852722616" r:id="rId18"/>
+        </w:object>
       </w:r>
     </w:p>
     <w:p>
@@ -15273,7 +15189,7 @@
                     <pic:cNvPicPr/>
                   </pic:nvPicPr>
                   <pic:blipFill>
-                    <a:blip r:embed="rId16"/>
+                    <a:blip r:embed="rId19"/>
                     <a:stretch>
                       <a:fillRect/>
                     </a:stretch>
@@ -16653,7 +16569,7 @@
         <w:rPr>
           <w:sz w:val="28"/>
           <w:szCs w:val="28"/>
-          <w:lang w:val="ru-RU"/>
+          <w:lang w:val="en-US"/>
         </w:rPr>
       </w:pPr>
       <w:r>
@@ -18544,16 +18460,70 @@
           <w:szCs w:val="28"/>
           <w:lang w:val="ru-RU"/>
         </w:rPr>
-        <w:t>and displays the result alongside the total number of matched v</w:t>
-      </w:r>
-      <w:proofErr w:type="spellStart"/>
-      <w:r>
-        <w:rPr>
-          <w:sz w:val="28"/>
-          <w:szCs w:val="28"/>
-          <w:lang w:val="ru-RU"/>
-        </w:rPr>
-        <w:t>alues</w:t>
+        <w:t xml:space="preserve">and displays the result alongside the total </w:t>
+      </w:r>
+      <w:proofErr w:type="spellStart"/>
+      <w:r>
+        <w:rPr>
+          <w:sz w:val="28"/>
+          <w:szCs w:val="28"/>
+          <w:lang w:val="ru-RU"/>
+        </w:rPr>
+        <w:t>number</w:t>
+      </w:r>
+      <w:proofErr w:type="spellEnd"/>
+      <w:r>
+        <w:rPr>
+          <w:sz w:val="28"/>
+          <w:szCs w:val="28"/>
+          <w:lang w:val="ru-RU"/>
+        </w:rPr>
+        <w:t xml:space="preserve"> </w:t>
+      </w:r>
+      <w:proofErr w:type="spellStart"/>
+      <w:r>
+        <w:rPr>
+          <w:sz w:val="28"/>
+          <w:szCs w:val="28"/>
+          <w:lang w:val="ru-RU"/>
+        </w:rPr>
+        <w:t>of</w:t>
+      </w:r>
+      <w:proofErr w:type="spellEnd"/>
+      <w:r>
+        <w:rPr>
+          <w:sz w:val="28"/>
+          <w:szCs w:val="28"/>
+          <w:lang w:val="ru-RU"/>
+        </w:rPr>
+        <w:t xml:space="preserve"> </w:t>
+      </w:r>
+      <w:proofErr w:type="spellStart"/>
+      <w:r>
+        <w:rPr>
+          <w:sz w:val="28"/>
+          <w:szCs w:val="28"/>
+          <w:lang w:val="ru-RU"/>
+        </w:rPr>
+        <w:t>matched</w:t>
+      </w:r>
+      <w:proofErr w:type="spellEnd"/>
+      <w:r>
+        <w:rPr>
+          <w:sz w:val="28"/>
+          <w:szCs w:val="28"/>
+          <w:lang w:val="ru-RU"/>
+        </w:rPr>
+        <w:t xml:space="preserve"> </w:t>
+      </w:r>
+      <w:proofErr w:type="spellStart"/>
+      <w:r>
+        <w:rPr>
+          <w:sz w:val="28"/>
+          <w:szCs w:val="28"/>
+          <w:lang w:val="ru-RU"/>
+        </w:rPr>
+        <w:t>values</w:t>
       </w:r>
       <w:proofErr w:type="spellEnd"/>
       <w:r>
@@ -18625,7 +18595,6 @@
     </w:p>
     <w:p>
       <w:pPr>
-        <w:spacing w:line="360" w:lineRule="auto"/>
         <w:jc w:val="center"/>
         <w:rPr>
           <w:b/>
@@ -18635,57 +18604,12 @@
         </w:rPr>
       </w:pPr>
       <w:r>
-        <w:rPr>
-          <w:noProof/>
-        </w:rPr>
-        <w:drawing>
-          <wp:inline distT="0" distB="0" distL="0" distR="0" wp14:anchorId="38330B41" wp14:editId="69B076A2">
-            <wp:extent cx="4785756" cy="8388457"/>
-            <wp:effectExtent l="0" t="0" r="0" b="0"/>
-            <wp:docPr id="202833760" name="Рисунок 73"/>
-            <wp:cNvGraphicFramePr>
-              <a:graphicFrameLocks xmlns:a="http://schemas.openxmlformats.org/drawingml/2006/main" noChangeAspect="1"/>
-            </wp:cNvGraphicFramePr>
-            <a:graphic xmlns:a="http://schemas.openxmlformats.org/drawingml/2006/main">
-              <a:graphicData uri="http://schemas.openxmlformats.org/drawingml/2006/picture">
-                <pic:pic xmlns:pic="http://schemas.openxmlformats.org/drawingml/2006/picture">
-                  <pic:nvPicPr>
-                    <pic:cNvPr id="0" name="Picture 9"/>
-                    <pic:cNvPicPr>
-                      <a:picLocks noChangeAspect="1" noChangeArrowheads="1"/>
-                    </pic:cNvPicPr>
-                  </pic:nvPicPr>
-                  <pic:blipFill>
-                    <a:blip r:embed="rId17" cstate="print">
-                      <a:extLst>
-                        <a:ext uri="{28A0092B-C50C-407E-A947-70E740481C1C}">
-                          <a14:useLocalDpi xmlns:a14="http://schemas.microsoft.com/office/drawing/2010/main" val="0"/>
-                        </a:ext>
-                      </a:extLst>
-                    </a:blip>
-                    <a:srcRect/>
-                    <a:stretch>
-                      <a:fillRect/>
-                    </a:stretch>
-                  </pic:blipFill>
-                  <pic:spPr bwMode="auto">
-                    <a:xfrm>
-                      <a:off x="0" y="0"/>
-                      <a:ext cx="4803809" cy="8420101"/>
-                    </a:xfrm>
-                    <a:prstGeom prst="rect">
-                      <a:avLst/>
-                    </a:prstGeom>
-                    <a:noFill/>
-                    <a:ln>
-                      <a:noFill/>
-                    </a:ln>
-                  </pic:spPr>
-                </pic:pic>
-              </a:graphicData>
-            </a:graphic>
-          </wp:inline>
-        </w:drawing>
+        <w:object w:dxaOrig="14575" w:dyaOrig="25717" w14:anchorId="5821E98F">
+          <v:shape id="_x0000_i1036" type="#_x0000_t75" style="width:381.5pt;height:673.8pt" o:ole="">
+            <v:imagedata r:id="rId20" o:title=""/>
+          </v:shape>
+          <o:OLEObject Type="Embed" ProgID="Unknown" ShapeID="_x0000_i1036" DrawAspect="Content" ObjectID="_1852722617" r:id="rId21"/>
+        </w:object>
       </w:r>
     </w:p>
     <w:p>
@@ -21479,7 +21403,7 @@
                     <pic:cNvPicPr/>
                   </pic:nvPicPr>
                   <pic:blipFill>
-                    <a:blip r:embed="rId18"/>
+                    <a:blip r:embed="rId22"/>
                     <a:stretch>
                       <a:fillRect/>
                     </a:stretch>
@@ -23964,43 +23888,7 @@
           <w:szCs w:val="28"/>
           <w:lang w:val="ru-RU"/>
         </w:rPr>
-        <w:t xml:space="preserve">, the program verifies numerical results against exact closed-form </w:t>
-      </w:r>
-      <w:proofErr w:type="spellStart"/>
-      <w:r>
-        <w:rPr>
-          <w:sz w:val="28"/>
-          <w:szCs w:val="28"/>
-          <w:lang w:val="ru-RU"/>
-        </w:rPr>
-        <w:t>expressions</w:t>
-      </w:r>
-      <w:proofErr w:type="spellEnd"/>
-      <w:r>
-        <w:rPr>
-          <w:sz w:val="28"/>
-          <w:szCs w:val="28"/>
-          <w:lang w:val="ru-RU"/>
-        </w:rPr>
-        <w:t xml:space="preserve"> </w:t>
-      </w:r>
-      <w:proofErr w:type="spellStart"/>
-      <w:r>
-        <w:rPr>
-          <w:sz w:val="28"/>
-          <w:szCs w:val="28"/>
-          <w:lang w:val="ru-RU"/>
-        </w:rPr>
-        <w:t>using</w:t>
-      </w:r>
-      <w:proofErr w:type="spellEnd"/>
-      <w:r>
-        <w:rPr>
-          <w:sz w:val="28"/>
-          <w:szCs w:val="28"/>
-          <w:lang w:val="ru-RU"/>
-        </w:rPr>
-        <w:t xml:space="preserve"> </w:t>
+        <w:t xml:space="preserve">, the program verifies numerical results against exact closed-form expressions using </w:t>
       </w:r>
       <w:proofErr w:type="spellStart"/>
       <w:r>
@@ -24303,29 +24191,10 @@
       </w:pPr>
       <w:r>
         <w:object w:dxaOrig="9022" w:dyaOrig="22937" w14:anchorId="1AF15608">
-          <v:shapetype id="_x0000_t75" coordsize="21600,21600" o:spt="75" o:preferrelative="t" path="m@4@5l@4@11@9@11@9@5xe" filled="f" stroked="f">
-            <v:stroke joinstyle="miter"/>
-            <v:formulas>
-              <v:f eqn="if lineDrawn pixelLineWidth 0"/>
-              <v:f eqn="sum @0 1 0"/>
-              <v:f eqn="sum 0 0 @1"/>
-              <v:f eqn="prod @2 1 2"/>
-              <v:f eqn="prod @3 21600 pixelWidth"/>
-              <v:f eqn="prod @3 21600 pixelHeight"/>
-              <v:f eqn="sum @0 0 1"/>
-              <v:f eqn="prod @6 1 2"/>
-              <v:f eqn="prod @7 21600 pixelWidth"/>
-              <v:f eqn="sum @8 21600 0"/>
-              <v:f eqn="prod @7 21600 pixelHeight"/>
-              <v:f eqn="sum @10 21600 0"/>
-            </v:formulas>
-            <v:path o:extrusionok="f" gradientshapeok="t" o:connecttype="rect"/>
-            <o:lock v:ext="edit" aspectratio="t"/>
-          </v:shapetype>
-          <v:shape id="_x0000_i1025" type="#_x0000_t75" style="width:261.75pt;height:666pt" o:ole="">
-            <v:imagedata r:id="rId19" o:title=""/>
+          <v:shape id="_x0000_i1025" type="#_x0000_t75" style="width:261.15pt;height:666.25pt" o:ole="">
+            <v:imagedata r:id="rId23" o:title=""/>
           </v:shape>
-          <o:OLEObject Type="Embed" ProgID="Unknown" ShapeID="_x0000_i1025" DrawAspect="Content" ObjectID="_1852653393" r:id="rId20"/>
+          <o:OLEObject Type="Embed" ProgID="Unknown" ShapeID="_x0000_i1025" DrawAspect="Content" ObjectID="_1852722618" r:id="rId24"/>
         </w:object>
       </w:r>
     </w:p>
@@ -27786,7 +27655,7 @@
                     <pic:cNvPicPr/>
                   </pic:nvPicPr>
                   <pic:blipFill>
-                    <a:blip r:embed="rId21"/>
+                    <a:blip r:embed="rId25"/>
                     <a:stretch>
                       <a:fillRect/>
                     </a:stretch>
@@ -28175,7 +28044,7 @@
                     </pic:cNvPicPr>
                   </pic:nvPicPr>
                   <pic:blipFill>
-                    <a:blip r:embed="rId22" cstate="print">
+                    <a:blip r:embed="rId26" cstate="print">
                       <a:extLst>
                         <a:ext uri="{28A0092B-C50C-407E-A947-70E740481C1C}">
                           <a14:useLocalDpi xmlns:a14="http://schemas.microsoft.com/office/drawing/2010/main" val="0"/>
@@ -48686,8 +48555,8 @@
       </w:pPr>
     </w:p>
     <w:sectPr>
-      <w:headerReference w:type="first" r:id="rId23"/>
-      <w:footerReference w:type="first" r:id="rId24"/>
+      <w:headerReference w:type="first" r:id="rId27"/>
+      <w:footerReference w:type="first" r:id="rId28"/>
       <w:pgSz w:w="11907" w:h="16840" w:code="9"/>
       <w:pgMar w:top="851" w:right="709" w:bottom="1418" w:left="1701" w:header="284" w:footer="851" w:gutter="0"/>
       <w:pgNumType w:start="1"/>
@@ -50408,7 +50277,7 @@
         </mc:Choice>
         <mc:Fallback>
           <w:pict>
-            <v:rect w14:anchorId="28538C43" id="Rectangle 47" o:spid="_x0000_s1026" style="position:absolute;margin-left:-20.75pt;margin-top:-60.4pt;width:186.05pt;height:14.45pt;z-index:251628032;visibility:visible;mso-wrap-style:square;mso-width-percent:0;mso-height-percent:0;mso-wrap-distance-left:9pt;mso-wrap-distance-top:0;mso-wrap-distance-right:9pt;mso-wrap-distance-bottom:0;mso-position-horizontal:absolute;mso-position-horizontal-relative:text;mso-position-vertical:absolute;mso-position-vertical-relative:text;mso-width-percent:0;mso-height-percent:0;mso-width-relative:page;mso-height-relative:page;v-text-anchor:top" o:gfxdata="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" filled="f" strokeweight=".25pt"/>
+            <v:rect w14:anchorId="3B9C67CB" id="Rectangle 47" o:spid="_x0000_s1026" style="position:absolute;margin-left:-20.75pt;margin-top:-60.4pt;width:186.05pt;height:14.45pt;z-index:251628032;visibility:visible;mso-wrap-style:square;mso-width-percent:0;mso-height-percent:0;mso-wrap-distance-left:9pt;mso-wrap-distance-top:0;mso-wrap-distance-right:9pt;mso-wrap-distance-bottom:0;mso-position-horizontal:absolute;mso-position-horizontal-relative:text;mso-position-vertical:absolute;mso-position-vertical-relative:text;mso-width-percent:0;mso-height-percent:0;mso-width-relative:page;mso-height-relative:page;v-text-anchor:top" o:gfxdata="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" filled="f" strokeweight=".25pt"/>
           </w:pict>
         </mc:Fallback>
       </mc:AlternateContent>
@@ -51148,7 +51017,7 @@
         </mc:Choice>
         <mc:Fallback>
           <w:pict>
-            <v:rect w14:anchorId="5516DE66" id="Rectangle 49" o:spid="_x0000_s1026" style="position:absolute;margin-left:-20.45pt;margin-top:-17.1pt;width:186.05pt;height:14.45pt;z-index:251633152;visibility:visible;mso-wrap-style:square;mso-width-percent:0;mso-height-percent:0;mso-wrap-distance-left:9pt;mso-wrap-distance-top:0;mso-wrap-distance-right:9pt;mso-wrap-distance-bottom:0;mso-position-horizontal:absolute;mso-position-horizontal-relative:text;mso-position-vertical:absolute;mso-position-vertical-relative:text;mso-width-percent:0;mso-height-percent:0;mso-width-relative:page;mso-height-relative:page;v-text-anchor:top" o:gfxdata="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" filled="f" strokeweight=".25pt"/>
+            <v:rect w14:anchorId="29001748" id="Rectangle 49" o:spid="_x0000_s1026" style="position:absolute;margin-left:-20.45pt;margin-top:-17.1pt;width:186.05pt;height:14.45pt;z-index:251633152;visibility:visible;mso-wrap-style:square;mso-width-percent:0;mso-height-percent:0;mso-wrap-distance-left:9pt;mso-wrap-distance-top:0;mso-wrap-distance-right:9pt;mso-wrap-distance-bottom:0;mso-position-horizontal:absolute;mso-position-horizontal-relative:text;mso-position-vertical:absolute;mso-position-vertical-relative:text;mso-width-percent:0;mso-height-percent:0;mso-width-relative:page;mso-height-relative:page;v-text-anchor:top" o:gfxdata="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" filled="f" strokeweight=".25pt"/>
           </w:pict>
         </mc:Fallback>
       </mc:AlternateContent>
@@ -51556,7 +51425,7 @@
         </mc:Choice>
         <mc:Fallback>
           <w:pict>
-            <v:rect w14:anchorId="1A31B955" id="Rectangle 38" o:spid="_x0000_s1026" style="position:absolute;margin-left:-20.7pt;margin-top:-45.9pt;width:186.05pt;height:14.45pt;z-index:251597312;visibility:visible;mso-wrap-style:square;mso-width-percent:0;mso-height-percent:0;mso-wrap-distance-left:9pt;mso-wrap-distance-top:0;mso-wrap-distance-right:9pt;mso-wrap-distance-bottom:0;mso-position-horizontal:absolute;mso-position-horizontal-relative:text;mso-position-vertical:absolute;mso-position-vertical-relative:text;mso-width-percent:0;mso-height-percent:0;mso-width-relative:page;mso-height-relative:page;v-text-anchor:top" o:gfxdata="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" filled="f" strokeweight="2pt"/>
+            <v:rect w14:anchorId="2D445FD0" id="Rectangle 38" o:spid="_x0000_s1026" style="position:absolute;margin-left:-20.7pt;margin-top:-45.9pt;width:186.05pt;height:14.45pt;z-index:251597312;visibility:visible;mso-wrap-style:square;mso-width-percent:0;mso-height-percent:0;mso-wrap-distance-left:9pt;mso-wrap-distance-top:0;mso-wrap-distance-right:9pt;mso-wrap-distance-bottom:0;mso-position-horizontal:absolute;mso-position-horizontal-relative:text;mso-position-vertical:absolute;mso-position-vertical-relative:text;mso-width-percent:0;mso-height-percent:0;mso-width-relative:page;mso-height-relative:page;v-text-anchor:top" o:gfxdata="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" filled="f" strokeweight="2pt"/>
           </w:pict>
         </mc:Fallback>
       </mc:AlternateContent>
@@ -52370,7 +52239,7 @@
         </mc:Choice>
         <mc:Fallback>
           <w:pict>
-            <v:rect w14:anchorId="2FB48441" id="Rectangle 37" o:spid="_x0000_s1026" style="position:absolute;margin-left:94.35pt;margin-top:-31.6pt;width:43pt;height:70.85pt;z-index:251592192;visibility:visible;mso-wrap-style:square;mso-width-percent:0;mso-height-percent:0;mso-wrap-distance-left:9pt;mso-wrap-distance-top:0;mso-wrap-distance-right:9pt;mso-wrap-distance-bottom:0;mso-position-horizontal:absolute;mso-position-horizontal-relative:text;mso-position-vertical:absolute;mso-position-vertical-relative:text;mso-width-percent:0;mso-height-percent:0;mso-width-relative:page;mso-height-relative:page;v-text-anchor:top" o:gfxdata="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" filled="f" strokeweight="2pt"/>
+            <v:rect w14:anchorId="26EEF10B" id="Rectangle 37" o:spid="_x0000_s1026" style="position:absolute;margin-left:94.35pt;margin-top:-31.6pt;width:43pt;height:70.85pt;z-index:251592192;visibility:visible;mso-wrap-style:square;mso-width-percent:0;mso-height-percent:0;mso-wrap-distance-left:9pt;mso-wrap-distance-top:0;mso-wrap-distance-right:9pt;mso-wrap-distance-bottom:0;mso-position-horizontal:absolute;mso-position-horizontal-relative:text;mso-position-vertical:absolute;mso-position-vertical-relative:text;mso-width-percent:0;mso-height-percent:0;mso-width-relative:page;mso-height-relative:page;v-text-anchor:top" o:gfxdata="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" filled="f" strokeweight="2pt"/>
           </w:pict>
         </mc:Fallback>
       </mc:AlternateContent>
@@ -52448,7 +52317,7 @@
         </mc:Choice>
         <mc:Fallback>
           <w:pict>
-            <v:rect w14:anchorId="11ED6B5C" id="Rectangle 51" o:spid="_x0000_s1026" style="position:absolute;margin-left:-20.75pt;margin-top:10.5pt;width:186.05pt;height:14.45pt;z-index:251638272;visibility:visible;mso-wrap-style:square;mso-width-percent:0;mso-height-percent:0;mso-wrap-distance-left:9pt;mso-wrap-distance-top:0;mso-wrap-distance-right:9pt;mso-wrap-distance-bottom:0;mso-position-horizontal:absolute;mso-position-horizontal-relative:text;mso-position-vertical:absolute;mso-position-vertical-relative:text;mso-width-percent:0;mso-height-percent:0;mso-width-relative:page;mso-height-relative:page;v-text-anchor:top" o:gfxdata="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" filled="f" strokeweight=".25pt"/>
+            <v:rect w14:anchorId="14B821FF" id="Rectangle 51" o:spid="_x0000_s1026" style="position:absolute;margin-left:-20.75pt;margin-top:10.5pt;width:186.05pt;height:14.45pt;z-index:251638272;visibility:visible;mso-wrap-style:square;mso-width-percent:0;mso-height-percent:0;mso-wrap-distance-left:9pt;mso-wrap-distance-top:0;mso-wrap-distance-right:9pt;mso-wrap-distance-bottom:0;mso-position-horizontal:absolute;mso-position-horizontal-relative:text;mso-position-vertical:absolute;mso-position-vertical-relative:text;mso-width-percent:0;mso-height-percent:0;mso-width-relative:page;mso-height-relative:page;v-text-anchor:top" o:gfxdata="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" filled="f" strokeweight=".25pt"/>
           </w:pict>
         </mc:Fallback>
       </mc:AlternateContent>
@@ -52526,7 +52395,7 @@
         </mc:Choice>
         <mc:Fallback>
           <w:pict>
-            <v:rect w14:anchorId="239E54FF" id="Rectangle 35" o:spid="_x0000_s1026" style="position:absolute;margin-left:-20.7pt;margin-top:-31.5pt;width:50.1pt;height:72.05pt;z-index:251581952;visibility:visible;mso-wrap-style:square;mso-width-percent:0;mso-height-percent:0;mso-wrap-distance-left:9pt;mso-wrap-distance-top:0;mso-wrap-distance-right:9pt;mso-wrap-distance-bottom:0;mso-position-horizontal:absolute;mso-position-horizontal-relative:text;mso-position-vertical:absolute;mso-position-vertical-relative:text;mso-width-percent:0;mso-height-percent:0;mso-width-relative:page;mso-height-relative:page;v-text-anchor:top" o:gfxdata="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" filled="f" strokeweight="2pt"/>
+            <v:rect w14:anchorId="452548AB" id="Rectangle 35" o:spid="_x0000_s1026" style="position:absolute;margin-left:-20.7pt;margin-top:-31.5pt;width:50.1pt;height:72.05pt;z-index:251581952;visibility:visible;mso-wrap-style:square;mso-width-percent:0;mso-height-percent:0;mso-wrap-distance-left:9pt;mso-wrap-distance-top:0;mso-wrap-distance-right:9pt;mso-wrap-distance-bottom:0;mso-position-horizontal:absolute;mso-position-horizontal-relative:text;mso-position-vertical:absolute;mso-position-vertical-relative:text;mso-width-percent:0;mso-height-percent:0;mso-width-relative:page;mso-height-relative:page;v-text-anchor:top" o:gfxdata="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" filled="f" strokeweight="2pt"/>
           </w:pict>
         </mc:Fallback>
       </mc:AlternateContent>
@@ -52604,7 +52473,7 @@
         </mc:Choice>
         <mc:Fallback>
           <w:pict>
-            <v:rect w14:anchorId="36B7475B" id="Rectangle 36" o:spid="_x0000_s1026" style="position:absolute;margin-left:29.7pt;margin-top:-31.5pt;width:64.45pt;height:72.05pt;z-index:251587072;visibility:visible;mso-wrap-style:square;mso-width-percent:0;mso-height-percent:0;mso-wrap-distance-left:9pt;mso-wrap-distance-top:0;mso-wrap-distance-right:9pt;mso-wrap-distance-bottom:0;mso-position-horizontal:absolute;mso-position-horizontal-relative:text;mso-position-vertical:absolute;mso-position-vertical-relative:text;mso-width-percent:0;mso-height-percent:0;mso-width-relative:page;mso-height-relative:page;v-text-anchor:top" o:gfxdata="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" filled="f" strokeweight="2pt"/>
+            <v:rect w14:anchorId="302E944C" id="Rectangle 36" o:spid="_x0000_s1026" style="position:absolute;margin-left:29.7pt;margin-top:-31.5pt;width:64.45pt;height:72.05pt;z-index:251587072;visibility:visible;mso-wrap-style:square;mso-width-percent:0;mso-height-percent:0;mso-wrap-distance-left:9pt;mso-wrap-distance-top:0;mso-wrap-distance-right:9pt;mso-wrap-distance-bottom:0;mso-position-horizontal:absolute;mso-position-horizontal-relative:text;mso-position-vertical:absolute;mso-position-vertical-relative:text;mso-width-percent:0;mso-height-percent:0;mso-width-relative:page;mso-height-relative:page;v-text-anchor:top" o:gfxdata="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" filled="f" strokeweight="2pt"/>
           </w:pict>
         </mc:Fallback>
       </mc:AlternateContent>
@@ -52682,7 +52551,7 @@
         </mc:Choice>
         <mc:Fallback>
           <w:pict>
-            <v:rect w14:anchorId="564CD597" id="Rectangle 45" o:spid="_x0000_s1026" style="position:absolute;margin-left:366.35pt;margin-top:-16.5pt;width:14.35pt;height:14.45pt;z-index:251622912;visibility:visible;mso-wrap-style:square;mso-width-percent:0;mso-height-percent:0;mso-wrap-distance-left:9pt;mso-wrap-distance-top:0;mso-wrap-distance-right:9pt;mso-wrap-distance-bottom:0;mso-position-horizontal:absolute;mso-position-horizontal-relative:text;mso-position-vertical:absolute;mso-position-vertical-relative:text;mso-width-percent:0;mso-height-percent:0;mso-width-relative:page;mso-height-relative:page;v-text-anchor:middle" o:gfxdata="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" filled="f" strokeweight=".25pt"/>
+            <v:rect w14:anchorId="738DADF1" id="Rectangle 45" o:spid="_x0000_s1026" style="position:absolute;margin-left:366.35pt;margin-top:-16.5pt;width:14.35pt;height:14.45pt;z-index:251622912;visibility:visible;mso-wrap-style:square;mso-width-percent:0;mso-height-percent:0;mso-wrap-distance-left:9pt;mso-wrap-distance-top:0;mso-wrap-distance-right:9pt;mso-wrap-distance-bottom:0;mso-position-horizontal:absolute;mso-position-horizontal-relative:text;mso-position-vertical:absolute;mso-position-vertical-relative:text;mso-width-percent:0;mso-height-percent:0;mso-width-relative:page;mso-height-relative:page;v-text-anchor:middle" o:gfxdata="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" filled="f" strokeweight=".25pt"/>
           </w:pict>
         </mc:Fallback>
       </mc:AlternateContent>
@@ -52760,7 +52629,7 @@
         </mc:Choice>
         <mc:Fallback>
           <w:pict>
-            <v:rect w14:anchorId="5CEAF8B4" id="Rectangle 41" o:spid="_x0000_s1026" style="position:absolute;margin-left:351.1pt;margin-top:-17.1pt;width:143.15pt;height:14.45pt;z-index:251612672;visibility:visible;mso-wrap-style:square;mso-width-percent:0;mso-height-percent:0;mso-wrap-distance-left:9pt;mso-wrap-distance-top:0;mso-wrap-distance-right:9pt;mso-wrap-distance-bottom:0;mso-position-horizontal:absolute;mso-position-horizontal-relative:text;mso-position-vertical:absolute;mso-position-vertical-relative:text;mso-width-percent:0;mso-height-percent:0;mso-width-relative:page;mso-height-relative:page;v-text-anchor:top" o:gfxdata="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" filled="f" strokeweight="2pt"/>
+            <v:rect w14:anchorId="609C2550" id="Rectangle 41" o:spid="_x0000_s1026" style="position:absolute;margin-left:351.1pt;margin-top:-17.1pt;width:143.15pt;height:14.45pt;z-index:251612672;visibility:visible;mso-wrap-style:square;mso-width-percent:0;mso-height-percent:0;mso-wrap-distance-left:9pt;mso-wrap-distance-top:0;mso-wrap-distance-right:9pt;mso-wrap-distance-bottom:0;mso-position-horizontal:absolute;mso-position-horizontal-relative:text;mso-position-vertical:absolute;mso-position-vertical-relative:text;mso-width-percent:0;mso-height-percent:0;mso-width-relative:page;mso-height-relative:page;v-text-anchor:top" o:gfxdata="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" filled="f" strokeweight="2pt"/>
           </w:pict>
         </mc:Fallback>
       </mc:AlternateContent>
@@ -53226,7 +53095,7 @@
         </mc:Choice>
         <mc:Fallback>
           <w:pict>
-            <v:rect w14:anchorId="6DE0D669" id="Rectangle 39" o:spid="_x0000_s1026" style="position:absolute;margin-left:351.05pt;margin-top:-31.5pt;width:143.15pt;height:72.05pt;z-index:251602432;visibility:visible;mso-wrap-style:square;mso-width-percent:0;mso-height-percent:0;mso-wrap-distance-left:9pt;mso-wrap-distance-top:0;mso-wrap-distance-right:9pt;mso-wrap-distance-bottom:0;mso-position-horizontal:absolute;mso-position-horizontal-relative:text;mso-position-vertical:absolute;mso-position-vertical-relative:text;mso-width-percent:0;mso-height-percent:0;mso-width-relative:page;mso-height-relative:page;v-text-anchor:top" o:gfxdata="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" filled="f" strokeweight="2pt"/>
+            <v:rect w14:anchorId="4ED0357D" id="Rectangle 39" o:spid="_x0000_s1026" style="position:absolute;margin-left:351.05pt;margin-top:-31.5pt;width:143.15pt;height:72.05pt;z-index:251602432;visibility:visible;mso-wrap-style:square;mso-width-percent:0;mso-height-percent:0;mso-wrap-distance-left:9pt;mso-wrap-distance-top:0;mso-wrap-distance-right:9pt;mso-wrap-distance-bottom:0;mso-position-horizontal:absolute;mso-position-horizontal-relative:text;mso-position-vertical:absolute;mso-position-vertical-relative:text;mso-width-percent:0;mso-height-percent:0;mso-width-relative:page;mso-height-relative:page;v-text-anchor:top" o:gfxdata="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" filled="f" strokeweight="2pt"/>
           </w:pict>
         </mc:Fallback>
       </mc:AlternateContent>
@@ -53304,7 +53173,7 @@
         </mc:Choice>
         <mc:Fallback>
           <w:pict>
-            <v:rect w14:anchorId="16523104" id="Rectangle 43" o:spid="_x0000_s1026" style="position:absolute;margin-left:395.15pt;margin-top:-31.5pt;width:50.15pt;height:28.85pt;z-index:251617792;visibility:visible;mso-wrap-style:square;mso-width-percent:0;mso-height-percent:0;mso-wrap-distance-left:9pt;mso-wrap-distance-top:0;mso-wrap-distance-right:9pt;mso-wrap-distance-bottom:0;mso-position-horizontal:absolute;mso-position-horizontal-relative:text;mso-position-vertical:absolute;mso-position-vertical-relative:text;mso-width-percent:0;mso-height-percent:0;mso-width-relative:page;mso-height-relative:page;v-text-anchor:top" o:gfxdata="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" filled="f" strokeweight="2pt"/>
+            <v:rect w14:anchorId="5DDDC7C2" id="Rectangle 43" o:spid="_x0000_s1026" style="position:absolute;margin-left:395.15pt;margin-top:-31.5pt;width:50.15pt;height:28.85pt;z-index:251617792;visibility:visible;mso-wrap-style:square;mso-width-percent:0;mso-height-percent:0;mso-wrap-distance-left:9pt;mso-wrap-distance-top:0;mso-wrap-distance-right:9pt;mso-wrap-distance-bottom:0;mso-position-horizontal:absolute;mso-position-horizontal-relative:text;mso-position-vertical:absolute;mso-position-vertical-relative:text;mso-width-percent:0;mso-height-percent:0;mso-width-relative:page;mso-height-relative:page;v-text-anchor:top" o:gfxdata="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" filled="f" strokeweight="2pt"/>
           </w:pict>
         </mc:Fallback>
       </mc:AlternateContent>
@@ -53382,7 +53251,7 @@
         </mc:Choice>
         <mc:Fallback>
           <w:pict>
-            <v:rect w14:anchorId="37AACFCE" id="Rectangle 40" o:spid="_x0000_s1026" style="position:absolute;margin-left:351.15pt;margin-top:-31.45pt;width:142.85pt;height:14.45pt;z-index:251607552;visibility:visible;mso-wrap-style:square;mso-width-percent:0;mso-height-percent:0;mso-wrap-distance-left:9pt;mso-wrap-distance-top:0;mso-wrap-distance-right:9pt;mso-wrap-distance-bottom:0;mso-position-horizontal:absolute;mso-position-horizontal-relative:text;mso-position-vertical:absolute;mso-position-vertical-relative:text;mso-width-percent:0;mso-height-percent:0;mso-width-relative:page;mso-height-relative:page;v-text-anchor:top" o:gfxdata="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" filled="f" strokeweight="2pt"/>
+            <v:rect w14:anchorId="185C506A" id="Rectangle 40" o:spid="_x0000_s1026" style="position:absolute;margin-left:351.15pt;margin-top:-31.45pt;width:142.85pt;height:14.45pt;z-index:251607552;visibility:visible;mso-wrap-style:square;mso-width-percent:0;mso-height-percent:0;mso-wrap-distance-left:9pt;mso-wrap-distance-top:0;mso-wrap-distance-right:9pt;mso-wrap-distance-bottom:0;mso-position-horizontal:absolute;mso-position-horizontal-relative:text;mso-position-vertical:absolute;mso-position-vertical-relative:text;mso-width-percent:0;mso-height-percent:0;mso-width-relative:page;mso-height-relative:page;v-text-anchor:top" o:gfxdata="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" filled="f" strokeweight="2pt"/>
           </w:pict>
         </mc:Fallback>
       </mc:AlternateContent>
@@ -53828,7 +53697,7 @@
         </mc:Choice>
         <mc:Fallback>
           <w:pict>
-            <v:line w14:anchorId="6A515833" id="Line 28" o:spid="_x0000_s1026" style="position:absolute;flip:x;z-index:251546112;visibility:visible;mso-wrap-style:square;mso-width-percent:0;mso-height-percent:0;mso-wrap-distance-left:9pt;mso-wrap-distance-top:0;mso-wrap-distance-right:9pt;mso-wrap-distance-bottom:0;mso-position-horizontal:absolute;mso-position-horizontal-relative:text;mso-position-vertical:absolute;mso-position-vertical-relative:text;mso-width-percent:0;mso-height-percent:0;mso-width-relative:page;mso-height-relative:page" from="-20.75pt,-31.5pt" to="494.4pt,-31.45pt" o:gfxdata="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" strokeweight="2pt"/>
+            <v:line w14:anchorId="224642C4" id="Line 28" o:spid="_x0000_s1026" style="position:absolute;flip:x;z-index:251546112;visibility:visible;mso-wrap-style:square;mso-width-percent:0;mso-height-percent:0;mso-wrap-distance-left:9pt;mso-wrap-distance-top:0;mso-wrap-distance-right:9pt;mso-wrap-distance-bottom:0;mso-position-horizontal:absolute;mso-position-horizontal-relative:text;mso-position-vertical:absolute;mso-position-vertical-relative:text;mso-width-percent:0;mso-height-percent:0;mso-width-relative:page;mso-height-relative:page" from="-20.75pt,-31.5pt" to="494.4pt,-31.45pt" o:gfxdata="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" strokeweight="2pt"/>
           </w:pict>
         </mc:Fallback>
       </mc:AlternateContent>
@@ -53906,7 +53775,7 @@
         </mc:Choice>
         <mc:Fallback>
           <w:pict>
-            <v:rect w14:anchorId="1F0999AF" id="Rectangle 31" o:spid="_x0000_s1026" style="position:absolute;margin-left:-20.65pt;margin-top:-74.7pt;width:21.5pt;height:43.25pt;z-index:251561472;visibility:visible;mso-wrap-style:square;mso-width-percent:0;mso-height-percent:0;mso-wrap-distance-left:9pt;mso-wrap-distance-top:0;mso-wrap-distance-right:9pt;mso-wrap-distance-bottom:0;mso-position-horizontal:absolute;mso-position-horizontal-relative:text;mso-position-vertical:absolute;mso-position-vertical-relative:text;mso-width-percent:0;mso-height-percent:0;mso-width-relative:page;mso-height-relative:page;v-text-anchor:top" o:gfxdata="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" filled="f" strokeweight="2pt"/>
+            <v:rect w14:anchorId="67D42A39" id="Rectangle 31" o:spid="_x0000_s1026" style="position:absolute;margin-left:-20.65pt;margin-top:-74.7pt;width:21.5pt;height:43.25pt;z-index:251561472;visibility:visible;mso-wrap-style:square;mso-width-percent:0;mso-height-percent:0;mso-wrap-distance-left:9pt;mso-wrap-distance-top:0;mso-wrap-distance-right:9pt;mso-wrap-distance-bottom:0;mso-position-horizontal:absolute;mso-position-horizontal-relative:text;mso-position-vertical:absolute;mso-position-vertical-relative:text;mso-width-percent:0;mso-height-percent:0;mso-width-relative:page;mso-height-relative:page;v-text-anchor:top" o:gfxdata="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" filled="f" strokeweight="2pt"/>
           </w:pict>
         </mc:Fallback>
       </mc:AlternateContent>
@@ -53984,7 +53853,7 @@
         </mc:Choice>
         <mc:Fallback>
           <w:pict>
-            <v:rect w14:anchorId="6F78815D" id="Rectangle 32" o:spid="_x0000_s1026" style="position:absolute;margin-left:.7pt;margin-top:-74.7pt;width:28.65pt;height:43.25pt;z-index:251566592;visibility:visible;mso-wrap-style:square;mso-width-percent:0;mso-height-percent:0;mso-wrap-distance-left:9pt;mso-wrap-distance-top:0;mso-wrap-distance-right:9pt;mso-wrap-distance-bottom:0;mso-position-horizontal:absolute;mso-position-horizontal-relative:text;mso-position-vertical:absolute;mso-position-vertical-relative:text;mso-width-percent:0;mso-height-percent:0;mso-width-relative:page;mso-height-relative:page;v-text-anchor:top" o:gfxdata="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" filled="f" strokeweight="2pt"/>
+            <v:rect w14:anchorId="538F0D93" id="Rectangle 32" o:spid="_x0000_s1026" style="position:absolute;margin-left:.7pt;margin-top:-74.7pt;width:28.65pt;height:43.25pt;z-index:251566592;visibility:visible;mso-wrap-style:square;mso-width-percent:0;mso-height-percent:0;mso-wrap-distance-left:9pt;mso-wrap-distance-top:0;mso-wrap-distance-right:9pt;mso-wrap-distance-bottom:0;mso-position-horizontal:absolute;mso-position-horizontal-relative:text;mso-position-vertical:absolute;mso-position-vertical-relative:text;mso-width-percent:0;mso-height-percent:0;mso-width-relative:page;mso-height-relative:page;v-text-anchor:top" o:gfxdata="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" filled="f" strokeweight="2pt"/>
           </w:pict>
         </mc:Fallback>
       </mc:AlternateContent>
@@ -54062,7 +53931,7 @@
         </mc:Choice>
         <mc:Fallback>
           <w:pict>
-            <v:rect w14:anchorId="66DB505E" id="Rectangle 33" o:spid="_x0000_s1026" style="position:absolute;margin-left:29.9pt;margin-top:-74.7pt;width:64.45pt;height:43.25pt;z-index:251571712;visibility:visible;mso-wrap-style:square;mso-width-percent:0;mso-height-percent:0;mso-wrap-distance-left:9pt;mso-wrap-distance-top:0;mso-wrap-distance-right:9pt;mso-wrap-distance-bottom:0;mso-position-horizontal:absolute;mso-position-horizontal-relative:text;mso-position-vertical:absolute;mso-position-vertical-relative:text;mso-width-percent:0;mso-height-percent:0;mso-width-relative:page;mso-height-relative:page;v-text-anchor:top" o:gfxdata="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" filled="f" strokeweight="2pt"/>
+            <v:rect w14:anchorId="7D62C2D7" id="Rectangle 33" o:spid="_x0000_s1026" style="position:absolute;margin-left:29.9pt;margin-top:-74.7pt;width:64.45pt;height:43.25pt;z-index:251571712;visibility:visible;mso-wrap-style:square;mso-width-percent:0;mso-height-percent:0;mso-wrap-distance-left:9pt;mso-wrap-distance-top:0;mso-wrap-distance-right:9pt;mso-wrap-distance-bottom:0;mso-position-horizontal:absolute;mso-position-horizontal-relative:text;mso-position-vertical:absolute;mso-position-vertical-relative:text;mso-width-percent:0;mso-height-percent:0;mso-width-relative:page;mso-height-relative:page;v-text-anchor:top" o:gfxdata="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" filled="f" strokeweight="2pt"/>
           </w:pict>
         </mc:Fallback>
       </mc:AlternateContent>
@@ -54140,7 +54009,7 @@
         </mc:Choice>
         <mc:Fallback>
           <w:pict>
-            <v:rect w14:anchorId="7091C9D6" id="Rectangle 34" o:spid="_x0000_s1026" style="position:absolute;margin-left:94.65pt;margin-top:-74.7pt;width:43pt;height:43.25pt;z-index:251576832;visibility:visible;mso-wrap-style:square;mso-width-percent:0;mso-height-percent:0;mso-wrap-distance-left:9pt;mso-wrap-distance-top:0;mso-wrap-distance-right:9pt;mso-wrap-distance-bottom:0;mso-position-horizontal:absolute;mso-position-horizontal-relative:text;mso-position-vertical:absolute;mso-position-vertical-relative:text;mso-width-percent:0;mso-height-percent:0;mso-width-relative:page;mso-height-relative:page;v-text-anchor:top" o:gfxdata="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" filled="f" strokeweight="2pt"/>
+            <v:rect w14:anchorId="16CD220D" id="Rectangle 34" o:spid="_x0000_s1026" style="position:absolute;margin-left:94.65pt;margin-top:-74.7pt;width:43pt;height:43.25pt;z-index:251576832;visibility:visible;mso-wrap-style:square;mso-width-percent:0;mso-height-percent:0;mso-wrap-distance-left:9pt;mso-wrap-distance-top:0;mso-wrap-distance-right:9pt;mso-wrap-distance-bottom:0;mso-position-horizontal:absolute;mso-position-horizontal-relative:text;mso-position-vertical:absolute;mso-position-vertical-relative:text;mso-width-percent:0;mso-height-percent:0;mso-width-relative:page;mso-height-relative:page;v-text-anchor:top" o:gfxdata="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" filled="f" strokeweight="2pt"/>
           </w:pict>
         </mc:Fallback>
       </mc:AlternateContent>
@@ -54218,7 +54087,7 @@
         </mc:Choice>
         <mc:Fallback>
           <w:pict>
-            <v:rect w14:anchorId="60C59407" id="Rectangle 29" o:spid="_x0000_s1026" style="position:absolute;margin-left:-20.75pt;margin-top:-74.7pt;width:515.15pt;height:115.25pt;z-index:251551232;visibility:visible;mso-wrap-style:square;mso-width-percent:0;mso-height-percent:0;mso-wrap-distance-left:9pt;mso-wrap-distance-top:0;mso-wrap-distance-right:9pt;mso-wrap-distance-bottom:0;mso-position-horizontal:absolute;mso-position-horizontal-relative:text;mso-position-vertical:absolute;mso-position-vertical-relative:text;mso-width-percent:0;mso-height-percent:0;mso-width-relative:page;mso-height-relative:page;v-text-anchor:top" o:gfxdata="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" filled="f" strokeweight="2pt"/>
+            <v:rect w14:anchorId="15DFC7B1" id="Rectangle 29" o:spid="_x0000_s1026" style="position:absolute;margin-left:-20.75pt;margin-top:-74.7pt;width:515.15pt;height:115.25pt;z-index:251551232;visibility:visible;mso-wrap-style:square;mso-width-percent:0;mso-height-percent:0;mso-wrap-distance-left:9pt;mso-wrap-distance-top:0;mso-wrap-distance-right:9pt;mso-wrap-distance-bottom:0;mso-position-horizontal:absolute;mso-position-horizontal-relative:text;mso-position-vertical:absolute;mso-position-vertical-relative:text;mso-width-percent:0;mso-height-percent:0;mso-width-relative:page;mso-height-relative:page;v-text-anchor:top" o:gfxdata="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" filled="f" strokeweight="2pt"/>
           </w:pict>
         </mc:Fallback>
       </mc:AlternateContent>
@@ -54296,7 +54165,7 @@
         </mc:Choice>
         <mc:Fallback>
           <w:pict>
-            <v:rect w14:anchorId="7BABB34E" id="Rectangle 30" o:spid="_x0000_s1026" style="position:absolute;margin-left:-20.7pt;margin-top:-74.55pt;width:186.05pt;height:114.8pt;z-index:251556352;visibility:visible;mso-wrap-style:square;mso-width-percent:0;mso-height-percent:0;mso-wrap-distance-left:9pt;mso-wrap-distance-top:0;mso-wrap-distance-right:9pt;mso-wrap-distance-bottom:0;mso-position-horizontal:absolute;mso-position-horizontal-relative:text;mso-position-vertical:absolute;mso-position-vertical-relative:text;mso-width-percent:0;mso-height-percent:0;mso-width-relative:page;mso-height-relative:page;v-text-anchor:top" o:gfxdata="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" filled="f" strokeweight="2pt"/>
+            <v:rect w14:anchorId="063EBA0C" id="Rectangle 30" o:spid="_x0000_s1026" style="position:absolute;margin-left:-20.7pt;margin-top:-74.55pt;width:186.05pt;height:114.8pt;z-index:251556352;visibility:visible;mso-wrap-style:square;mso-width-percent:0;mso-height-percent:0;mso-wrap-distance-left:9pt;mso-wrap-distance-top:0;mso-wrap-distance-right:9pt;mso-wrap-distance-bottom:0;mso-position-horizontal:absolute;mso-position-horizontal-relative:text;mso-position-vertical:absolute;mso-position-vertical-relative:text;mso-width-percent:0;mso-height-percent:0;mso-width-relative:page;mso-height-relative:page;v-text-anchor:top" o:gfxdata="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" filled="f" strokeweight="2pt"/>
           </w:pict>
         </mc:Fallback>
       </mc:AlternateContent>
@@ -54731,7 +54600,7 @@
         </mc:Choice>
         <mc:Fallback>
           <w:pict>
-            <v:line w14:anchorId="19C01D7B" id="Line 5" o:spid="_x0000_s1026" style="position:absolute;z-index:251542016;visibility:visible;mso-wrap-style:square;mso-width-percent:0;mso-height-percent:0;mso-wrap-distance-left:9pt;mso-wrap-distance-top:0;mso-wrap-distance-right:9pt;mso-wrap-distance-bottom:0;mso-position-horizontal:absolute;mso-position-horizontal-relative:text;mso-position-vertical:absolute;mso-position-vertical-relative:text;mso-width-percent:0;mso-height-percent:0;mso-width-relative:page;mso-height-relative:page" from="-20.2pt,5.5pt" to="-20.2pt,769pt" o:gfxdata="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" o:allowincell="f" strokeweight="2pt"/>
+            <v:line w14:anchorId="70D02882" id="Line 5" o:spid="_x0000_s1026" style="position:absolute;z-index:251542016;visibility:visible;mso-wrap-style:square;mso-width-percent:0;mso-height-percent:0;mso-wrap-distance-left:9pt;mso-wrap-distance-top:0;mso-wrap-distance-right:9pt;mso-wrap-distance-bottom:0;mso-position-horizontal:absolute;mso-position-horizontal-relative:text;mso-position-vertical:absolute;mso-position-vertical-relative:text;mso-width-percent:0;mso-height-percent:0;mso-width-relative:page;mso-height-relative:page" from="-20.2pt,5.5pt" to="-20.2pt,769pt" o:gfxdata="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" o:allowincell="f" strokeweight="2pt"/>
           </w:pict>
         </mc:Fallback>
       </mc:AlternateContent>
@@ -54805,7 +54674,7 @@
         </mc:Choice>
         <mc:Fallback>
           <w:pict>
-            <v:line w14:anchorId="22EF0336" id="Line 1" o:spid="_x0000_s1026" style="position:absolute;z-index:251537920;visibility:visible;mso-wrap-style:square;mso-width-percent:0;mso-height-percent:0;mso-wrap-distance-left:9pt;mso-wrap-distance-top:0;mso-wrap-distance-right:9pt;mso-wrap-distance-bottom:0;mso-position-horizontal:absolute;mso-position-horizontal-relative:text;mso-position-vertical:absolute;mso-position-vertical-relative:text;mso-width-percent:0;mso-height-percent:0;mso-width-relative:page;mso-height-relative:page" from="-21pt,6.25pt" to="495.05pt,6.3pt" o:gfxdata="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" o:allowincell="f" strokeweight="2pt"/>
+            <v:line w14:anchorId="5C16BBB5" id="Line 1" o:spid="_x0000_s1026" style="position:absolute;z-index:251537920;visibility:visible;mso-wrap-style:square;mso-width-percent:0;mso-height-percent:0;mso-wrap-distance-left:9pt;mso-wrap-distance-top:0;mso-wrap-distance-right:9pt;mso-wrap-distance-bottom:0;mso-position-horizontal:absolute;mso-position-horizontal-relative:text;mso-position-vertical:absolute;mso-position-vertical-relative:text;mso-width-percent:0;mso-height-percent:0;mso-width-relative:page;mso-height-relative:page" from="-21pt,6.25pt" to="495.05pt,6.3pt" o:gfxdata="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" o:allowincell="f" strokeweight="2pt"/>
           </w:pict>
         </mc:Fallback>
       </mc:AlternateContent>
@@ -54879,7 +54748,7 @@
         </mc:Choice>
         <mc:Fallback>
           <w:pict>
-            <v:line w14:anchorId="486B9948" id="Line 3" o:spid="_x0000_s1026" style="position:absolute;flip:x;z-index:251540992;visibility:visible;mso-wrap-style:square;mso-width-percent:0;mso-height-percent:0;mso-wrap-distance-left:9pt;mso-wrap-distance-top:0;mso-wrap-distance-right:9pt;mso-wrap-distance-bottom:0;mso-position-horizontal:absolute;mso-position-horizontal-relative:text;mso-position-vertical:absolute;mso-position-vertical-relative:text;mso-width-percent:0;mso-height-percent:0;mso-width-relative:page;mso-height-relative:page" from="492.8pt,5.5pt" to="494.3pt,768.9pt" o:gfxdata="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" strokeweight="2pt"/>
+            <v:line w14:anchorId="4150CE0B" id="Line 3" o:spid="_x0000_s1026" style="position:absolute;flip:x;z-index:251540992;visibility:visible;mso-wrap-style:square;mso-width-percent:0;mso-height-percent:0;mso-wrap-distance-left:9pt;mso-wrap-distance-top:0;mso-wrap-distance-right:9pt;mso-wrap-distance-bottom:0;mso-position-horizontal:absolute;mso-position-horizontal-relative:text;mso-position-vertical:absolute;mso-position-vertical-relative:text;mso-width-percent:0;mso-height-percent:0;mso-width-relative:page;mso-height-relative:page" from="492.8pt,5.5pt" to="494.3pt,768.9pt" o:gfxdata="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" strokeweight="2pt"/>
           </w:pict>
         </mc:Fallback>
       </mc:AlternateContent>
@@ -54983,7 +54852,7 @@
         </mc:Choice>
         <mc:Fallback>
           <w:pict>
-            <v:line w14:anchorId="34BB3D79" id="Line 4" o:spid="_x0000_s1026" style="position:absolute;z-index:251771392;visibility:visible;mso-wrap-style:square;mso-width-percent:0;mso-height-percent:0;mso-wrap-distance-left:9pt;mso-wrap-distance-top:0;mso-wrap-distance-right:9pt;mso-wrap-distance-bottom:0;mso-position-horizontal:absolute;mso-position-horizontal-relative:text;mso-position-vertical:absolute;mso-position-vertical-relative:text;mso-width-percent:0;mso-height-percent:0;mso-width-relative:page;mso-height-relative:page" from="494.05pt,4.45pt" to="494.45pt,790.15pt" o:gfxdata="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" strokeweight="2pt"/>
+            <v:line w14:anchorId="3ABFD1E7" id="Line 4" o:spid="_x0000_s1026" style="position:absolute;z-index:251771392;visibility:visible;mso-wrap-style:square;mso-width-percent:0;mso-height-percent:0;mso-wrap-distance-left:9pt;mso-wrap-distance-top:0;mso-wrap-distance-right:9pt;mso-wrap-distance-bottom:0;mso-position-horizontal:absolute;mso-position-horizontal-relative:text;mso-position-vertical:absolute;mso-position-vertical-relative:text;mso-width-percent:0;mso-height-percent:0;mso-width-relative:page;mso-height-relative:page" from="494.05pt,4.45pt" to="494.45pt,790.15pt" o:gfxdata="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" strokeweight="2pt"/>
           </w:pict>
         </mc:Fallback>
       </mc:AlternateContent>
@@ -55057,7 +54926,7 @@
         </mc:Choice>
         <mc:Fallback>
           <w:pict>
-            <v:line w14:anchorId="40741F58" id="Line 4" o:spid="_x0000_s1026" style="position:absolute;z-index:251761152;visibility:visible;mso-wrap-style:square;mso-width-percent:0;mso-height-percent:0;mso-wrap-distance-left:9pt;mso-wrap-distance-top:0;mso-wrap-distance-right:9pt;mso-wrap-distance-bottom:0;mso-position-horizontal:absolute;mso-position-horizontal-relative:text;mso-position-vertical:absolute;mso-position-vertical-relative:text;mso-width-percent:0;mso-height-percent:0;mso-width-relative:page;mso-height-relative:page" from="-20.65pt,5pt" to="-20.25pt,790.7pt" o:gfxdata="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" strokeweight="2pt"/>
+            <v:line w14:anchorId="1ADC17AF" id="Line 4" o:spid="_x0000_s1026" style="position:absolute;z-index:251761152;visibility:visible;mso-wrap-style:square;mso-width-percent:0;mso-height-percent:0;mso-wrap-distance-left:9pt;mso-wrap-distance-top:0;mso-wrap-distance-right:9pt;mso-wrap-distance-bottom:0;mso-position-horizontal:absolute;mso-position-horizontal-relative:text;mso-position-vertical:absolute;mso-position-vertical-relative:text;mso-width-percent:0;mso-height-percent:0;mso-width-relative:page;mso-height-relative:page" from="-20.65pt,5pt" to="-20.25pt,790.7pt" o:gfxdata="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" strokeweight="2pt"/>
           </w:pict>
         </mc:Fallback>
       </mc:AlternateContent>
@@ -55131,7 +55000,7 @@
         </mc:Choice>
         <mc:Fallback>
           <w:pict>
-            <v:line w14:anchorId="1B81173A" id="Line 1" o:spid="_x0000_s1026" style="position:absolute;z-index:251776512;visibility:visible;mso-wrap-style:square;mso-width-percent:0;mso-height-percent:0;mso-wrap-distance-left:9pt;mso-wrap-distance-top:0;mso-wrap-distance-right:9pt;mso-wrap-distance-bottom:0;mso-position-horizontal:absolute;mso-position-horizontal-relative:text;mso-position-vertical:absolute;mso-position-vertical-relative:text;mso-width-percent:0;mso-height-percent:0;mso-width-relative:page;mso-height-relative:page" from="-22.2pt,5.25pt" to="493.85pt,5.3pt" o:gfxdata="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" o:allowincell="f" strokeweight="2pt"/>
+            <v:line w14:anchorId="2D657149" id="Line 1" o:spid="_x0000_s1026" style="position:absolute;z-index:251776512;visibility:visible;mso-wrap-style:square;mso-width-percent:0;mso-height-percent:0;mso-wrap-distance-left:9pt;mso-wrap-distance-top:0;mso-wrap-distance-right:9pt;mso-wrap-distance-bottom:0;mso-position-horizontal:absolute;mso-position-horizontal-relative:text;mso-position-vertical:absolute;mso-position-vertical-relative:text;mso-width-percent:0;mso-height-percent:0;mso-width-relative:page;mso-height-relative:page" from="-22.2pt,5.25pt" to="493.85pt,5.3pt" o:gfxdata="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" o:allowincell="f" strokeweight="2pt"/>
           </w:pict>
         </mc:Fallback>
       </mc:AlternateContent>
@@ -55205,7 +55074,7 @@
         </mc:Choice>
         <mc:Fallback>
           <w:pict>
-            <v:line w14:anchorId="7B7CDB08" id="Line 6" o:spid="_x0000_s1026" style="position:absolute;flip:x;z-index:251766272;visibility:visible;mso-wrap-style:square;mso-width-percent:0;mso-height-percent:0;mso-wrap-distance-left:9pt;mso-wrap-distance-top:0;mso-wrap-distance-right:9pt;mso-wrap-distance-bottom:0;mso-position-horizontal:absolute;mso-position-horizontal-relative:text;mso-position-vertical:absolute;mso-position-vertical-relative:text;mso-width-percent:0;mso-height-percent:0;mso-width-relative:page;mso-height-relative:page" from="-535.3pt,-.05pt" to="-535.3pt,802.85pt" o:gfxdata="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" o:allowincell="f" strokeweight="2pt"/>
+            <v:line w14:anchorId="006D723F" id="Line 6" o:spid="_x0000_s1026" style="position:absolute;flip:x;z-index:251766272;visibility:visible;mso-wrap-style:square;mso-width-percent:0;mso-height-percent:0;mso-wrap-distance-left:9pt;mso-wrap-distance-top:0;mso-wrap-distance-right:9pt;mso-wrap-distance-bottom:0;mso-position-horizontal:absolute;mso-position-horizontal-relative:text;mso-position-vertical:absolute;mso-position-vertical-relative:text;mso-width-percent:0;mso-height-percent:0;mso-width-relative:page;mso-height-relative:page" from="-535.3pt,-.05pt" to="-535.3pt,802.85pt" o:gfxdata="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" o:allowincell="f" strokeweight="2pt"/>
           </w:pict>
         </mc:Fallback>
       </mc:AlternateContent>
@@ -60752,6 +60621,7 @@
   <w:style w:type="character" w:default="1" w:styleId="a0">
     <w:name w:val="Default Paragraph Font"/>
     <w:uiPriority w:val="1"/>
+    <w:semiHidden/>
     <w:unhideWhenUsed/>
   </w:style>
   <w:style w:type="table" w:default="1" w:styleId="a1">

</xml_diff>